<commit_message>
Ukloni odgovore na komentare iz DOCX fajlova
Ostaju samo top-level komentari/pitanja, sortirani po lajkovima.

Co-authored-by: DamboSlonce <DamboSlonce@users.noreply.github.com>
</commit_message>
<xml_diff>
--- a/Dokumentacija/TikTok_komentari_vukasin_vvl_po_lajkovima.docx
+++ b/Dokumentacija/TikTok_komentari_vukasin_vvl_po_lajkovima.docx
@@ -24,15 +24,11 @@
         <w:br/>
         <w:t>Ukupno na TikToku (API): 567</w:t>
         <w:br/>
-        <w:t>Izvučeno komentara: 298</w:t>
-        <w:br/>
-        <w:t>Izvučeno odgovora (replies): 113</w:t>
+        <w:t>Top-level komentari (bez odgovora): 298</w:t>
         <w:br/>
         <w:t>Sortiranje: opadajuće po broju lajkova</w:t>
         <w:br/>
-        <w:t>Generisano: 2026-09-25 16:02 UTC</w:t>
-        <w:br/>
-        <w:t>Napomena: TikTok filtrira deo komentara, pa broj izvučenih može biti manji od ukupnog.</w:t>
+        <w:t>Generisano: 2026-09-25 16:09 UTC</w:t>
       </w:r>
     </w:p>
     <w:p/>
@@ -51,9 +47,6 @@
       </w:r>
       <w:r>
         <w:t xml:space="preserve">  ·  Liked by creator</w:t>
-      </w:r>
-      <w:r>
-        <w:t xml:space="preserve">  ·  12 odgovora</w:t>
       </w:r>
       <w:r>
         <w:t xml:space="preserve">  ·  2026-09-22 18:54</w:t>
@@ -69,174 +62,6 @@
       </w:r>
     </w:p>
     <w:p>
-      <w:pPr>
-        <w:ind w:left="567"/>
-      </w:pPr>
-      <w:r>
-        <w:rPr>
-          <w:i/>
-        </w:rPr>
-        <w:t xml:space="preserve">↳ 51❤  dunjaivnv (@dunjaivnv): </w:t>
-      </w:r>
-      <w:r>
-        <w:t>HABABABABABABABBA</w:t>
-      </w:r>
-    </w:p>
-    <w:p>
-      <w:pPr>
-        <w:ind w:left="567"/>
-      </w:pPr>
-      <w:r>
-        <w:rPr>
-          <w:i/>
-        </w:rPr>
-        <w:t xml:space="preserve">↳ 40❤  Лука (@kaluu_10): </w:t>
-      </w:r>
-      <w:r>
-        <w:t>Humor ekvivalentan detetu od pet godina</w:t>
-      </w:r>
-    </w:p>
-    <w:p>
-      <w:pPr>
-        <w:ind w:left="567"/>
-      </w:pPr>
-      <w:r>
-        <w:rPr>
-          <w:i/>
-        </w:rPr>
-        <w:t xml:space="preserve">↳ 12❤  Адра (@cryracha): </w:t>
-      </w:r>
-      <w:r>
-        <w:t>misliiiš?</w:t>
-      </w:r>
-    </w:p>
-    <w:p>
-      <w:pPr>
-        <w:ind w:left="567"/>
-      </w:pPr>
-      <w:r>
-        <w:rPr>
-          <w:i/>
-        </w:rPr>
-        <w:t xml:space="preserve">↳ 3❤  🦇 (@sektogas7): </w:t>
-      </w:r>
-      <w:r>
-        <w:t>jesil ulovio sebi nekog</w:t>
-      </w:r>
-    </w:p>
-    <w:p>
-      <w:pPr>
-        <w:ind w:left="567"/>
-      </w:pPr>
-      <w:r>
-        <w:rPr>
-          <w:i/>
-        </w:rPr>
-        <w:t xml:space="preserve">↳ 3❤  M🥀 (@milicanikoliicc): </w:t>
-      </w:r>
-      <w:r>
-        <w:t>ja tebe obozavam</w:t>
-      </w:r>
-    </w:p>
-    <w:p>
-      <w:pPr>
-        <w:ind w:left="567"/>
-      </w:pPr>
-      <w:r>
-        <w:rPr>
-          <w:i/>
-        </w:rPr>
-        <w:t xml:space="preserve">↳ 3❤  aleksa (@mqteeorr): </w:t>
-      </w:r>
-      <w:r>
-        <w:t>buraz svaka riba lici na kiklopa</w:t>
-      </w:r>
-    </w:p>
-    <w:p>
-      <w:pPr>
-        <w:ind w:left="567"/>
-      </w:pPr>
-      <w:r>
-        <w:rPr>
-          <w:i/>
-        </w:rPr>
-        <w:t xml:space="preserve">↳ 2❤  Tasic8i (@tasic8i): </w:t>
-      </w:r>
-      <w:r>
-        <w:t>сви људи тамо су пик ми, само што је разлика што су ликови отишли да покажу њихове мишиће и јадност а девојке курвирлук, свака је тамо просечна или идпод</w:t>
-      </w:r>
-    </w:p>
-    <w:p>
-      <w:pPr>
-        <w:ind w:left="567"/>
-      </w:pPr>
-      <w:r>
-        <w:rPr>
-          <w:i/>
-        </w:rPr>
-        <w:t xml:space="preserve">↳ 2❤  Mv (@mvmata2): </w:t>
-      </w:r>
-      <w:r>
-        <w:t>Jesu</w:t>
-      </w:r>
-    </w:p>
-    <w:p>
-      <w:pPr>
-        <w:ind w:left="567"/>
-      </w:pPr>
-      <w:r>
-        <w:rPr>
-          <w:i/>
-        </w:rPr>
-        <w:t xml:space="preserve">↳ 0❤  :) (@baannshhee): </w:t>
-      </w:r>
-      <w:r>
-        <w:t>🔥🔥🔥</w:t>
-      </w:r>
-    </w:p>
-    <w:p>
-      <w:pPr>
-        <w:ind w:left="567"/>
-      </w:pPr>
-      <w:r>
-        <w:rPr>
-          <w:i/>
-        </w:rPr>
-        <w:t xml:space="preserve">↳ 0❤  David117🇷🇸 (@david117999): </w:t>
-      </w:r>
-      <w:r>
-        <w:t>pa gusko nije devojkaa birala nego drugi decko je birao njegovu devojku 🤦</w:t>
-      </w:r>
-    </w:p>
-    <w:p>
-      <w:pPr>
-        <w:ind w:left="567"/>
-      </w:pPr>
-      <w:r>
-        <w:rPr>
-          <w:i/>
-        </w:rPr>
-        <w:t xml:space="preserve">↳ 0❤  Joe_5 (@jj0e5): </w:t>
-      </w:r>
-      <w:r>
-        <w:t>ako si ti singer ja sam Karleuša</w:t>
-      </w:r>
-    </w:p>
-    <w:p>
-      <w:pPr>
-        <w:ind w:left="567"/>
-      </w:pPr>
-      <w:r>
-        <w:rPr>
-          <w:i/>
-        </w:rPr>
-        <w:t xml:space="preserve">↳ 0❤  nikoliccc (@nikolic.1): </w:t>
-      </w:r>
-      <w:r>
-        <w:t>8000-ti lajk</w:t>
-      </w:r>
-    </w:p>
-    <w:p>
       <w:r>
         <w:rPr>
           <w:b/>
@@ -251,9 +76,6 @@
       </w:r>
       <w:r>
         <w:t xml:space="preserve">  ·  Liked by creator</w:t>
-      </w:r>
-      <w:r>
-        <w:t xml:space="preserve">  ·  27 odgovora</w:t>
       </w:r>
       <w:r>
         <w:t xml:space="preserve">  ·  2026-09-22 17:39</w:t>
@@ -269,370 +91,6 @@
       </w:r>
     </w:p>
     <w:p>
-      <w:pPr>
-        <w:ind w:left="567"/>
-      </w:pPr>
-      <w:r>
-        <w:rPr>
-          <w:i/>
-        </w:rPr>
-        <w:t xml:space="preserve">↳ 301❤  Vukašin (@vukasin.vvl): </w:t>
-      </w:r>
-      <w:r>
-        <w:t>🤔</w:t>
-      </w:r>
-    </w:p>
-    <w:p>
-      <w:pPr>
-        <w:ind w:left="567"/>
-      </w:pPr>
-      <w:r>
-        <w:rPr>
-          <w:i/>
-        </w:rPr>
-        <w:t xml:space="preserve">↳ 45❤  ~azra~ (@aazzrraa12): </w:t>
-      </w:r>
-      <w:r>
-        <w:t>znala sam da mi je poznat</w:t>
-      </w:r>
-    </w:p>
-    <w:p>
-      <w:pPr>
-        <w:ind w:left="567"/>
-      </w:pPr>
-      <w:r>
-        <w:rPr>
-          <w:i/>
-        </w:rPr>
-        <w:t xml:space="preserve">↳ 2❤  🇪🇸 (@andjic9): </w:t>
-      </w:r>
-      <w:r>
-        <w:t>da</w:t>
-      </w:r>
-    </w:p>
-    <w:p>
-      <w:pPr>
-        <w:ind w:left="567"/>
-      </w:pPr>
-      <w:r>
-        <w:rPr>
-          <w:i/>
-        </w:rPr>
-        <w:t xml:space="preserve">↳ 1❤  una (@_unnnna_): </w:t>
-      </w:r>
-      <w:r>
-        <w:t>da</w:t>
-      </w:r>
-    </w:p>
-    <w:p>
-      <w:pPr>
-        <w:ind w:left="567"/>
-      </w:pPr>
-      <w:r>
-        <w:rPr>
-          <w:i/>
-        </w:rPr>
-        <w:t xml:space="preserve">↳ 1❤  💜8️⃣🤍 (@jaksa.nedeljlkovi): </w:t>
-      </w:r>
-      <w:r>
-        <w:t>da</w:t>
-      </w:r>
-    </w:p>
-    <w:p>
-      <w:pPr>
-        <w:ind w:left="567"/>
-      </w:pPr>
-      <w:r>
-        <w:rPr>
-          <w:i/>
-        </w:rPr>
-        <w:t xml:space="preserve">↳ 1❤  Росић🎰 (@rosic.95): </w:t>
-      </w:r>
-      <w:r>
-        <w:t>Ima da se ubijemmmmm</w:t>
-      </w:r>
-    </w:p>
-    <w:p>
-      <w:pPr>
-        <w:ind w:left="567"/>
-      </w:pPr>
-      <w:r>
-        <w:rPr>
-          <w:i/>
-        </w:rPr>
-        <w:t xml:space="preserve">↳ 1❤  D_🦎 (@deksa___7): </w:t>
-      </w:r>
-      <w:r>
-        <w:t>Daaaa</w:t>
-      </w:r>
-    </w:p>
-    <w:p>
-      <w:pPr>
-        <w:ind w:left="567"/>
-      </w:pPr>
-      <w:r>
-        <w:rPr>
-          <w:i/>
-        </w:rPr>
-        <w:t xml:space="preserve">↳ 1❤  jelena_nklc (@jecax75): </w:t>
-      </w:r>
-      <w:r>
-        <w:t>Istttt</w:t>
-      </w:r>
-    </w:p>
-    <w:p>
-      <w:pPr>
-        <w:ind w:left="567"/>
-      </w:pPr>
-      <w:r>
-        <w:rPr>
-          <w:i/>
-        </w:rPr>
-        <w:t xml:space="preserve">↳ 0❤  Luka Tenma (@yoez2k0): </w:t>
-      </w:r>
-      <w:r>
-        <w:t>Da</w:t>
-      </w:r>
-    </w:p>
-    <w:p>
-      <w:pPr>
-        <w:ind w:left="567"/>
-      </w:pPr>
-      <w:r>
-        <w:rPr>
-          <w:i/>
-        </w:rPr>
-        <w:t xml:space="preserve">↳ 0❤  петра (@niciforovichhh_): </w:t>
-      </w:r>
-      <w:r>
-        <w:t>Da</w:t>
-      </w:r>
-    </w:p>
-    <w:p>
-      <w:pPr>
-        <w:ind w:left="567"/>
-      </w:pPr>
-      <w:r>
-        <w:rPr>
-          <w:i/>
-        </w:rPr>
-        <w:t xml:space="preserve">↳ 0❤  Kika🇷🇸🏀🎸 (@kristinaiva3162): </w:t>
-      </w:r>
-      <w:r>
-        <w:t>Da</w:t>
-      </w:r>
-    </w:p>
-    <w:p>
-      <w:pPr>
-        <w:ind w:left="567"/>
-      </w:pPr>
-      <w:r>
-        <w:rPr>
-          <w:i/>
-        </w:rPr>
-        <w:t xml:space="preserve">↳ 0❤  🇷🇸deki☦️ (@moniei30): </w:t>
-      </w:r>
-      <w:r>
-        <w:t>Yes</w:t>
-      </w:r>
-    </w:p>
-    <w:p>
-      <w:pPr>
-        <w:ind w:left="567"/>
-      </w:pPr>
-      <w:r>
-        <w:rPr>
-          <w:i/>
-        </w:rPr>
-        <w:t xml:space="preserve">↳ 0❤  Luka (@luka52671): </w:t>
-      </w:r>
-      <w:r>
-        <w:t>Da da jesi majstore</w:t>
-      </w:r>
-    </w:p>
-    <w:p>
-      <w:pPr>
-        <w:ind w:left="567"/>
-      </w:pPr>
-      <w:r>
-        <w:rPr>
-          <w:i/>
-        </w:rPr>
-        <w:t xml:space="preserve">↳ 0❤  𝓱𝓮𝓵𝓮𝓷𝓪𝓶𝓲𝓽𝓽🤍🐚🪐 (@helen4mitic): </w:t>
-      </w:r>
-      <w:r>
-        <w:t>Daa</w:t>
-      </w:r>
-    </w:p>
-    <w:p>
-      <w:pPr>
-        <w:ind w:left="567"/>
-      </w:pPr>
-      <w:r>
-        <w:rPr>
-          <w:i/>
-        </w:rPr>
-        <w:t xml:space="preserve">↳ 0❤  Jovanović🇧🇷 (@veljkojovanovic009): </w:t>
-      </w:r>
-      <w:r>
-        <w:t>jeste</w:t>
-      </w:r>
-    </w:p>
-    <w:p>
-      <w:pPr>
-        <w:ind w:left="567"/>
-      </w:pPr>
-      <w:r>
-        <w:rPr>
-          <w:i/>
-        </w:rPr>
-        <w:t xml:space="preserve">↳ 0❤  Bacho_16 (@daviixbacho): </w:t>
-      </w:r>
-      <w:r>
-        <w:t>Da bio je</w:t>
-      </w:r>
-    </w:p>
-    <w:p>
-      <w:pPr>
-        <w:ind w:left="567"/>
-      </w:pPr>
-      <w:r>
-        <w:rPr>
-          <w:i/>
-        </w:rPr>
-        <w:t xml:space="preserve">↳ 0❤  luka_pisarević (@luka.pisarevic8): </w:t>
-      </w:r>
-      <w:r>
-        <w:t>Da</w:t>
-      </w:r>
-    </w:p>
-    <w:p>
-      <w:pPr>
-        <w:ind w:left="567"/>
-      </w:pPr>
-      <w:r>
-        <w:rPr>
-          <w:i/>
-        </w:rPr>
-        <w:t xml:space="preserve">↳ 0❤  pavle866 (@pavle866): </w:t>
-      </w:r>
-      <w:r>
-        <w:t>I jel jesi</w:t>
-      </w:r>
-    </w:p>
-    <w:p>
-      <w:pPr>
-        <w:ind w:left="567"/>
-      </w:pPr>
-      <w:r>
-        <w:rPr>
-          <w:i/>
-        </w:rPr>
-        <w:t xml:space="preserve">↳ 0❤  Itscoka__ (@darija.53): </w:t>
-      </w:r>
-      <w:r>
-        <w:t>daaa to je onaj najlepsi[Starstruck]</w:t>
-      </w:r>
-    </w:p>
-    <w:p>
-      <w:pPr>
-        <w:ind w:left="567"/>
-      </w:pPr>
-      <w:r>
-        <w:rPr>
-          <w:i/>
-        </w:rPr>
-        <w:t xml:space="preserve">↳ 0❤  🇪🇸 (@simkelaa1234): </w:t>
-      </w:r>
-      <w:r>
-        <w:t>Da</w:t>
-      </w:r>
-    </w:p>
-    <w:p>
-      <w:pPr>
-        <w:ind w:left="567"/>
-      </w:pPr>
-      <w:r>
-        <w:rPr>
-          <w:i/>
-        </w:rPr>
-        <w:t xml:space="preserve">↳ 0❤  _marinkee (@kragujevac6): </w:t>
-      </w:r>
-      <w:r>
-        <w:t>bahaaaahaaa</w:t>
-      </w:r>
-    </w:p>
-    <w:p>
-      <w:pPr>
-        <w:ind w:left="567"/>
-      </w:pPr>
-      <w:r>
-        <w:rPr>
-          <w:i/>
-        </w:rPr>
-        <w:t xml:space="preserve">↳ 0❤  _marinkee (@kragujevac6): </w:t>
-      </w:r>
-      <w:r>
-        <w:t>1800 likeeeee</w:t>
-      </w:r>
-    </w:p>
-    <w:p>
-      <w:pPr>
-        <w:ind w:left="567"/>
-      </w:pPr>
-      <w:r>
-        <w:rPr>
-          <w:i/>
-        </w:rPr>
-        <w:t xml:space="preserve">↳ 0❤  Росић🎰 (@rosic.95): </w:t>
-      </w:r>
-      <w:r>
-        <w:t>Dodje mi da izbrisem com</w:t>
-      </w:r>
-    </w:p>
-    <w:p>
-      <w:pPr>
-        <w:ind w:left="567"/>
-      </w:pPr>
-      <w:r>
-        <w:rPr>
-          <w:i/>
-        </w:rPr>
-        <w:t xml:space="preserve">↳ 0❤  _marinkee (@kragujevac6): </w:t>
-      </w:r>
-      <w:r>
-        <w:t>ni sluc</w:t>
-      </w:r>
-    </w:p>
-    <w:p>
-      <w:pPr>
-        <w:ind w:left="567"/>
-      </w:pPr>
-      <w:r>
-        <w:rPr>
-          <w:i/>
-        </w:rPr>
-        <w:t xml:space="preserve">↳ 0❤  🌺🫧SQUISHY AMALIJA🌺🫧 (@squushy.amalija): </w:t>
-      </w:r>
-      <w:r>
-        <w:t>Daaa</w:t>
-      </w:r>
-    </w:p>
-    <w:p>
-      <w:pPr>
-        <w:ind w:left="567"/>
-      </w:pPr>
-      <w:r>
-        <w:rPr>
-          <w:i/>
-        </w:rPr>
-        <w:t xml:space="preserve">↳ 0❤  Džoni (@nikolabajlovic): </w:t>
-      </w:r>
-      <w:r>
-        <w:t>Da</w:t>
-      </w:r>
-    </w:p>
-    <w:p>
       <w:r>
         <w:rPr>
           <w:b/>
@@ -678,9 +136,6 @@
         <w:t xml:space="preserve">  ·  Liked by creator</w:t>
       </w:r>
       <w:r>
-        <w:t xml:space="preserve">  ·  3 odgovora</w:t>
-      </w:r>
-      <w:r>
         <w:t xml:space="preserve">  ·  2026-09-22 17:51</w:t>
       </w:r>
     </w:p>
@@ -694,48 +149,6 @@
       </w:r>
     </w:p>
     <w:p>
-      <w:pPr>
-        <w:ind w:left="567"/>
-      </w:pPr>
-      <w:r>
-        <w:rPr>
-          <w:i/>
-        </w:rPr>
-        <w:t xml:space="preserve">↳ 58❤  sanda.djordjevic (@sendiiii_9): </w:t>
-      </w:r>
-      <w:r>
-        <w:t>Aposlutno se sve slažem sa tobom. Isto sam ga doživela, doduse bilo mi je žao kad je ispao onog momenta kad je Tara počela da plače a Vukašin je bio u fazonu "Nemoj da plačeš molim te" i počeo da okreće glavu od nje jer se tu videlo da ni njemu nije bilo svejedno zbog ishoda te situacije</w:t>
-      </w:r>
-    </w:p>
-    <w:p>
-      <w:pPr>
-        <w:ind w:left="567"/>
-      </w:pPr>
-      <w:r>
-        <w:rPr>
-          <w:i/>
-        </w:rPr>
-        <w:t xml:space="preserve">↳ 1❤  dora (@teyyii5): </w:t>
-      </w:r>
-      <w:r>
-        <w:t>pretacno</w:t>
-      </w:r>
-    </w:p>
-    <w:p>
-      <w:pPr>
-        <w:ind w:left="567"/>
-      </w:pPr>
-      <w:r>
-        <w:rPr>
-          <w:i/>
-        </w:rPr>
-        <w:t xml:space="preserve">↳ 1❤  . (@kestenjar): </w:t>
-      </w:r>
-      <w:r>
-        <w:t>pffft</w:t>
-      </w:r>
-    </w:p>
-    <w:p>
       <w:r>
         <w:rPr>
           <w:b/>
@@ -750,9 +163,6 @@
       </w:r>
       <w:r>
         <w:t xml:space="preserve">  ·  Liked by creator</w:t>
-      </w:r>
-      <w:r>
-        <w:t xml:space="preserve">  ·  1 odgovora</w:t>
       </w:r>
       <w:r>
         <w:t xml:space="preserve">  ·  2026-09-23 20:24</w:t>
@@ -768,20 +178,6 @@
       </w:r>
     </w:p>
     <w:p>
-      <w:pPr>
-        <w:ind w:left="567"/>
-      </w:pPr>
-      <w:r>
-        <w:rPr>
-          <w:i/>
-        </w:rPr>
-        <w:t xml:space="preserve">↳ 22❤  Aldox (@aldox211): </w:t>
-      </w:r>
-      <w:r>
-        <w:t>a tebi ?? a da nije Vukašin</w:t>
-      </w:r>
-    </w:p>
-    <w:p>
       <w:r>
         <w:rPr>
           <w:b/>
@@ -796,9 +192,6 @@
       </w:r>
       <w:r>
         <w:t xml:space="preserve">  ·  Liked by creator</w:t>
-      </w:r>
-      <w:r>
-        <w:t xml:space="preserve">  ·  3 odgovora</w:t>
       </w:r>
       <w:r>
         <w:t xml:space="preserve">  ·  2026-09-22 17:32</w:t>
@@ -814,34 +207,6 @@
       </w:r>
     </w:p>
     <w:p>
-      <w:pPr>
-        <w:ind w:left="567"/>
-      </w:pPr>
-      <w:r>
-        <w:rPr>
-          <w:i/>
-        </w:rPr>
-        <w:t xml:space="preserve">↳ 172❤  ivaalukic (@ivaalukic): </w:t>
-      </w:r>
-      <w:r>
-        <w:t>Bilo bi top da udje opet kao bombshell iii uzme svoju devojku nazad ovi novi likovi suu sranje zivo mnogo mii je zao Tare i Vukijaa</w:t>
-      </w:r>
-    </w:p>
-    <w:p>
-      <w:pPr>
-        <w:ind w:left="567"/>
-      </w:pPr>
-      <w:r>
-        <w:rPr>
-          <w:i/>
-        </w:rPr>
-        <w:t xml:space="preserve">↳ 143❤  Vukašin (@vukasin.vvl): </w:t>
-      </w:r>
-      <w:r>
-        <w:t>🤔</w:t>
-      </w:r>
-    </w:p>
-    <w:p>
       <w:r>
         <w:rPr>
           <w:b/>
@@ -853,9 +218,6 @@
           <w:b/>
         </w:rPr>
         <w:t>emy.core (@my.myself.i.core)</w:t>
-      </w:r>
-      <w:r>
-        <w:t xml:space="preserve">  ·  2 odgovora</w:t>
       </w:r>
       <w:r>
         <w:t xml:space="preserve">  ·  2026-09-22 19:12</w:t>
@@ -871,34 +233,6 @@
       </w:r>
     </w:p>
     <w:p>
-      <w:pPr>
-        <w:ind w:left="567"/>
-      </w:pPr>
-      <w:r>
-        <w:rPr>
-          <w:i/>
-        </w:rPr>
-        <w:t xml:space="preserve">↳ 0❤  x (@lovvinglyy): </w:t>
-      </w:r>
-      <w:r>
-        <w:t>🤪🤔</w:t>
-      </w:r>
-    </w:p>
-    <w:p>
-      <w:pPr>
-        <w:ind w:left="567"/>
-      </w:pPr>
-      <w:r>
-        <w:rPr>
-          <w:i/>
-        </w:rPr>
-        <w:t xml:space="preserve">↳ 0❤  username84281040 (@username84281040): </w:t>
-      </w:r>
-      <w:r>
-        <w:t>objektivna istina koju zene ne mogu da prihvate 😭✌️</w:t>
-      </w:r>
-    </w:p>
-    <w:p>
       <w:r>
         <w:rPr>
           <w:b/>
@@ -910,9 +244,6 @@
           <w:b/>
         </w:rPr>
         <w:t>Martina (@bosnjakkkm3)</w:t>
-      </w:r>
-      <w:r>
-        <w:t xml:space="preserve">  ·  7 odgovora</w:t>
       </w:r>
       <w:r>
         <w:t xml:space="preserve">  ·  2026-09-22 18:49</w:t>
@@ -928,62 +259,6 @@
       </w:r>
     </w:p>
     <w:p>
-      <w:pPr>
-        <w:ind w:left="567"/>
-      </w:pPr>
-      <w:r>
-        <w:rPr>
-          <w:i/>
-        </w:rPr>
-        <w:t xml:space="preserve">↳ 32❤  🐀 (@mollysk91): </w:t>
-      </w:r>
-      <w:r>
-        <w:t>To je rijaliti ne serija, zamisli plakat na rijaliti show💀</w:t>
-      </w:r>
-    </w:p>
-    <w:p>
-      <w:pPr>
-        <w:ind w:left="567"/>
-      </w:pPr>
-      <w:r>
-        <w:rPr>
-          <w:i/>
-        </w:rPr>
-        <w:t xml:space="preserve">↳ 12❤  ITACHI UCHIHA (@crnidjordje11): </w:t>
-      </w:r>
-      <w:r>
-        <w:t>kad si debilka</w:t>
-      </w:r>
-    </w:p>
-    <w:p>
-      <w:pPr>
-        <w:ind w:left="567"/>
-      </w:pPr>
-      <w:r>
-        <w:rPr>
-          <w:i/>
-        </w:rPr>
-        <w:t xml:space="preserve">↳ 7❤  laura (@cendaklaura): </w:t>
-      </w:r>
-      <w:r>
-        <w:t>(bez teksta)</w:t>
-      </w:r>
-    </w:p>
-    <w:p>
-      <w:pPr>
-        <w:ind w:left="567"/>
-      </w:pPr>
-      <w:r>
-        <w:rPr>
-          <w:i/>
-        </w:rPr>
-        <w:t xml:space="preserve">↳ 5❤  monimish (@trizmand): </w:t>
-      </w:r>
-      <w:r>
-        <w:t>embarrassing</w:t>
-      </w:r>
-    </w:p>
-    <w:p>
       <w:r>
         <w:rPr>
           <w:b/>
@@ -998,9 +273,6 @@
       </w:r>
       <w:r>
         <w:t xml:space="preserve">  ·  Liked by creator</w:t>
-      </w:r>
-      <w:r>
-        <w:t xml:space="preserve">  ·  4 odgovora</w:t>
       </w:r>
       <w:r>
         <w:t xml:space="preserve">  ·  2026-09-22 17:39</w:t>
@@ -1016,62 +288,6 @@
       </w:r>
     </w:p>
     <w:p>
-      <w:pPr>
-        <w:ind w:left="567"/>
-      </w:pPr>
-      <w:r>
-        <w:rPr>
-          <w:i/>
-        </w:rPr>
-        <w:t xml:space="preserve">↳ 172❤  jole (@jovanaradic5): </w:t>
-      </w:r>
-      <w:r>
-        <w:t>Roberto i Gašper bi dobili pojačanje da je ostao</w:t>
-      </w:r>
-    </w:p>
-    <w:p>
-      <w:pPr>
-        <w:ind w:left="567"/>
-      </w:pPr>
-      <w:r>
-        <w:rPr>
-          <w:i/>
-        </w:rPr>
-        <w:t xml:space="preserve">↳ 72❤  Onako (@tekonakoo): </w:t>
-      </w:r>
-      <w:r>
-        <w:t>nema ovaj misljenje</w:t>
-      </w:r>
-    </w:p>
-    <w:p>
-      <w:pPr>
-        <w:ind w:left="567"/>
-      </w:pPr>
-      <w:r>
-        <w:rPr>
-          <w:i/>
-        </w:rPr>
-        <w:t xml:space="preserve">↳ 21❤  Vukašin (@vukasin.vvl): </w:t>
-      </w:r>
-      <w:r>
-        <w:t>🤔</w:t>
-      </w:r>
-    </w:p>
-    <w:p>
-      <w:pPr>
-        <w:ind w:left="567"/>
-      </w:pPr>
-      <w:r>
-        <w:rPr>
-          <w:i/>
-        </w:rPr>
-        <w:t xml:space="preserve">↳ 1❤  Luka Tenma (@yoez2k0): </w:t>
-      </w:r>
-      <w:r>
-        <w:t>au mora pogledam</w:t>
-      </w:r>
-    </w:p>
-    <w:p>
       <w:r>
         <w:rPr>
           <w:b/>
@@ -1086,9 +302,6 @@
       </w:r>
       <w:r>
         <w:t xml:space="preserve">  ·  Liked by creator</w:t>
-      </w:r>
-      <w:r>
-        <w:t xml:space="preserve">  ·  2 odgovora</w:t>
       </w:r>
       <w:r>
         <w:t xml:space="preserve">  ·  2026-09-22 17:52</w:t>
@@ -1104,34 +317,6 @@
       </w:r>
     </w:p>
     <w:p>
-      <w:pPr>
-        <w:ind w:left="567"/>
-      </w:pPr>
-      <w:r>
-        <w:rPr>
-          <w:i/>
-        </w:rPr>
-        <w:t xml:space="preserve">↳ 29❤  Vukašin (@vukasin.vvl): </w:t>
-      </w:r>
-      <w:r>
-        <w:t>🤔</w:t>
-      </w:r>
-    </w:p>
-    <w:p>
-      <w:pPr>
-        <w:ind w:left="567"/>
-      </w:pPr>
-      <w:r>
-        <w:rPr>
-          <w:i/>
-        </w:rPr>
-        <w:t xml:space="preserve">↳ 6❤  Mel👑 (@blonde_devil_26): </w:t>
-      </w:r>
-      <w:r>
-        <w:t>Odma će ti reci 😂</w:t>
-      </w:r>
-    </w:p>
-    <w:p>
       <w:r>
         <w:rPr>
           <w:b/>
@@ -1203,9 +388,6 @@
         <w:t xml:space="preserve">  ·  Liked by creator</w:t>
       </w:r>
       <w:r>
-        <w:t xml:space="preserve">  ·  3 odgovora</w:t>
-      </w:r>
-      <w:r>
         <w:t xml:space="preserve">  ·  2026-09-22 18:39</w:t>
       </w:r>
     </w:p>
@@ -1219,48 +401,6 @@
       </w:r>
     </w:p>
     <w:p>
-      <w:pPr>
-        <w:ind w:left="567"/>
-      </w:pPr>
-      <w:r>
-        <w:rPr>
-          <w:i/>
-        </w:rPr>
-        <w:t xml:space="preserve">↳ 21❤  Vukašin (@vukasin.vvl): </w:t>
-      </w:r>
-      <w:r>
-        <w:t>🤔</w:t>
-      </w:r>
-    </w:p>
-    <w:p>
-      <w:pPr>
-        <w:ind w:left="567"/>
-      </w:pPr>
-      <w:r>
-        <w:rPr>
-          <w:i/>
-        </w:rPr>
-        <w:t xml:space="preserve">↳ 0❤  I (@iskra.banovicc): </w:t>
-      </w:r>
-      <w:r>
-        <w:t>Kad ces da odgovorisss</w:t>
-      </w:r>
-    </w:p>
-    <w:p>
-      <w:pPr>
-        <w:ind w:left="567"/>
-      </w:pPr>
-      <w:r>
-        <w:rPr>
-          <w:i/>
-        </w:rPr>
-        <w:t xml:space="preserve">↳ 0❤  Alisezah (@alisezah8): </w:t>
-      </w:r>
-      <w:r>
-        <w:t>Ajde</w:t>
-      </w:r>
-    </w:p>
-    <w:p>
       <w:r>
         <w:rPr>
           <w:b/>
@@ -1300,9 +440,6 @@
         <w:t>ℒℯ𝓃𝓀𝒶🎞 (@llenka.obradovic)</w:t>
       </w:r>
       <w:r>
-        <w:t xml:space="preserve">  ·  6 odgovora</w:t>
-      </w:r>
-      <w:r>
         <w:t xml:space="preserve">  ·  2026-09-23 11:06</w:t>
       </w:r>
     </w:p>
@@ -1316,90 +453,6 @@
       </w:r>
     </w:p>
     <w:p>
-      <w:pPr>
-        <w:ind w:left="567"/>
-      </w:pPr>
-      <w:r>
-        <w:rPr>
-          <w:i/>
-        </w:rPr>
-        <w:t xml:space="preserve">↳ 7❤  🖤 (@iviccchh): </w:t>
-      </w:r>
-      <w:r>
-        <w:t>Najvrv ce Tara nadje drugog</w:t>
-      </w:r>
-    </w:p>
-    <w:p>
-      <w:pPr>
-        <w:ind w:left="567"/>
-      </w:pPr>
-      <w:r>
-        <w:rPr>
-          <w:i/>
-        </w:rPr>
-        <w:t xml:space="preserve">↳ 3❤  ℒℯ𝓃𝓀𝒶🎞 (@llenka.obradovic): </w:t>
-      </w:r>
-      <w:r>
-        <w:t>Nadam se</w:t>
-      </w:r>
-    </w:p>
-    <w:p>
-      <w:pPr>
-        <w:ind w:left="567"/>
-      </w:pPr>
-      <w:r>
-        <w:rPr>
-          <w:i/>
-        </w:rPr>
-        <w:t xml:space="preserve">↳ 2❤  Mihajlo (@mihajlo_savic2): </w:t>
-      </w:r>
-      <w:r>
-        <w:t>cvrc</w:t>
-      </w:r>
-    </w:p>
-    <w:p>
-      <w:pPr>
-        <w:ind w:left="567"/>
-      </w:pPr>
-      <w:r>
-        <w:rPr>
-          <w:i/>
-        </w:rPr>
-        <w:t xml:space="preserve">↳ 2❤  ･ + ♪ ˖ ✧ (@_.moonlust): </w:t>
-      </w:r>
-      <w:r>
-        <w:t>aj tink da oce</w:t>
-      </w:r>
-    </w:p>
-    <w:p>
-      <w:pPr>
-        <w:ind w:left="567"/>
-      </w:pPr>
-      <w:r>
-        <w:rPr>
-          <w:i/>
-        </w:rPr>
-        <w:t xml:space="preserve">↳ 1❤  Blagoje (@blagoje_dikic): </w:t>
-      </w:r>
-      <w:r>
-        <w:t>lenka sta je ovo</w:t>
-      </w:r>
-    </w:p>
-    <w:p>
-      <w:pPr>
-        <w:ind w:left="567"/>
-      </w:pPr>
-      <w:r>
-        <w:rPr>
-          <w:i/>
-        </w:rPr>
-        <w:t xml:space="preserve">↳ 0❤  ･ + ♪ ˖ ✧ (@_.moonlust): </w:t>
-      </w:r>
-      <w:r>
-        <w:t>isto</w:t>
-      </w:r>
-    </w:p>
-    <w:p>
       <w:r>
         <w:rPr>
           <w:b/>
@@ -1414,9 +467,6 @@
       </w:r>
       <w:r>
         <w:t xml:space="preserve">  ·  Liked by creator</w:t>
-      </w:r>
-      <w:r>
-        <w:t xml:space="preserve">  ·  1 odgovora</w:t>
       </w:r>
       <w:r>
         <w:t xml:space="preserve">  ·  2026-09-22 18:02</w:t>
@@ -1432,20 +482,6 @@
       </w:r>
     </w:p>
     <w:p>
-      <w:pPr>
-        <w:ind w:left="567"/>
-      </w:pPr>
-      <w:r>
-        <w:rPr>
-          <w:i/>
-        </w:rPr>
-        <w:t xml:space="preserve">↳ 14❤  Vukašin (@vukasin.vvl): </w:t>
-      </w:r>
-      <w:r>
-        <w:t>🫡</w:t>
-      </w:r>
-    </w:p>
-    <w:p>
       <w:r>
         <w:rPr>
           <w:b/>
@@ -1485,9 +521,6 @@
         <w:t>ksenijicaa (@_ksenija_najjaca_)</w:t>
       </w:r>
       <w:r>
-        <w:t xml:space="preserve">  ·  5 odgovora</w:t>
-      </w:r>
-      <w:r>
         <w:t xml:space="preserve">  ·  2026-09-22 17:45</w:t>
       </w:r>
     </w:p>
@@ -1501,76 +534,6 @@
       </w:r>
     </w:p>
     <w:p>
-      <w:pPr>
-        <w:ind w:left="567"/>
-      </w:pPr>
-      <w:r>
-        <w:rPr>
-          <w:i/>
-        </w:rPr>
-        <w:t xml:space="preserve">↳ 1❤  Jovan(: slavic (@js_md_edits): </w:t>
-      </w:r>
-      <w:r>
-        <w:t>Au ksenija</w:t>
-      </w:r>
-    </w:p>
-    <w:p>
-      <w:pPr>
-        <w:ind w:left="567"/>
-      </w:pPr>
-      <w:r>
-        <w:rPr>
-          <w:i/>
-        </w:rPr>
-        <w:t xml:space="preserve">↳ 1❤  ☦️🇪🇸 (@nikolajov0): </w:t>
-      </w:r>
-      <w:r>
-        <w:t>😂😂</w:t>
-      </w:r>
-    </w:p>
-    <w:p>
-      <w:pPr>
-        <w:ind w:left="567"/>
-      </w:pPr>
-      <w:r>
-        <w:rPr>
-          <w:i/>
-        </w:rPr>
-        <w:t xml:space="preserve">↳ 1❤  nadjo (@nadja_t28): </w:t>
-      </w:r>
-      <w:r>
-        <w:t>Buk</w:t>
-      </w:r>
-    </w:p>
-    <w:p>
-      <w:pPr>
-        <w:ind w:left="567"/>
-      </w:pPr>
-      <w:r>
-        <w:rPr>
-          <w:i/>
-        </w:rPr>
-        <w:t xml:space="preserve">↳ 1❤  𝒜𝓃𝒹𝒿𝒶💐 (@andjelijaaaaaaaaaaaaaaaa): </w:t>
-      </w:r>
-      <w:r>
-        <w:t>Hahahahahahahaha</w:t>
-      </w:r>
-    </w:p>
-    <w:p>
-      <w:pPr>
-        <w:ind w:left="567"/>
-      </w:pPr>
-      <w:r>
-        <w:rPr>
-          <w:i/>
-        </w:rPr>
-        <w:t xml:space="preserve">↳ 0❤  ksenijicaa (@_ksenija_najjaca_): </w:t>
-      </w:r>
-      <w:r>
-        <w:t>Ti si au jovane</w:t>
-      </w:r>
-    </w:p>
-    <w:p>
       <w:r>
         <w:rPr>
           <w:b/>
@@ -1613,9 +576,6 @@
         <w:t xml:space="preserve">  ·  Liked by creator</w:t>
       </w:r>
       <w:r>
-        <w:t xml:space="preserve">  ·  1 odgovora</w:t>
-      </w:r>
-      <w:r>
         <w:t xml:space="preserve">  ·  2026-09-22 18:03</w:t>
       </w:r>
     </w:p>
@@ -1629,20 +589,6 @@
       </w:r>
     </w:p>
     <w:p>
-      <w:pPr>
-        <w:ind w:left="567"/>
-      </w:pPr>
-      <w:r>
-        <w:rPr>
-          <w:i/>
-        </w:rPr>
-        <w:t xml:space="preserve">↳ 2❤  Vukašin (@vukasin.vvl): </w:t>
-      </w:r>
-      <w:r>
-        <w:t>🤔</w:t>
-      </w:r>
-    </w:p>
-    <w:p>
       <w:r>
         <w:rPr>
           <w:b/>
@@ -1682,9 +628,6 @@
         <w:t>💜 (@jovanovicm07)</w:t>
       </w:r>
       <w:r>
-        <w:t xml:space="preserve">  ·  1 odgovora</w:t>
-      </w:r>
-      <w:r>
         <w:t xml:space="preserve">  ·  2026-09-22 17:50</w:t>
       </w:r>
     </w:p>
@@ -1698,20 +641,6 @@
       </w:r>
     </w:p>
     <w:p>
-      <w:pPr>
-        <w:ind w:left="567"/>
-      </w:pPr>
-      <w:r>
-        <w:rPr>
-          <w:i/>
-        </w:rPr>
-        <w:t xml:space="preserve">↳ 1❤  jelicch_ (@d82821g): </w:t>
-      </w:r>
-      <w:r>
-        <w:t>Hahahahaah</w:t>
-      </w:r>
-    </w:p>
-    <w:p>
       <w:r>
         <w:rPr>
           <w:b/>
@@ -1726,9 +655,6 @@
       </w:r>
       <w:r>
         <w:t xml:space="preserve">  ·  Liked by creator</w:t>
-      </w:r>
-      <w:r>
-        <w:t xml:space="preserve">  ·  1 odgovora</w:t>
       </w:r>
       <w:r>
         <w:t xml:space="preserve">  ·  2026-09-22 18:36</w:t>
@@ -1744,20 +670,6 @@
       </w:r>
     </w:p>
     <w:p>
-      <w:pPr>
-        <w:ind w:left="567"/>
-      </w:pPr>
-      <w:r>
-        <w:rPr>
-          <w:i/>
-        </w:rPr>
-        <w:t xml:space="preserve">↳ 3❤  Vukašin (@vukasin.vvl): </w:t>
-      </w:r>
-      <w:r>
-        <w:t>🤔</w:t>
-      </w:r>
-    </w:p>
-    <w:p>
       <w:r>
         <w:rPr>
           <w:b/>
@@ -1769,9 +681,6 @@
           <w:b/>
         </w:rPr>
         <w:t>kulja_f (@kulja_f)</w:t>
-      </w:r>
-      <w:r>
-        <w:t xml:space="preserve">  ·  6 odgovora</w:t>
       </w:r>
       <w:r>
         <w:t xml:space="preserve">  ·  2026-09-22 17:13</w:t>
@@ -1787,20 +696,6 @@
       </w:r>
     </w:p>
     <w:p>
-      <w:pPr>
-        <w:ind w:left="567"/>
-      </w:pPr>
-      <w:r>
-        <w:rPr>
-          <w:i/>
-        </w:rPr>
-        <w:t xml:space="preserve">↳ 2❤  11010 (@l33vu_210): </w:t>
-      </w:r>
-      <w:r>
-        <w:t>sta pises bre ti</w:t>
-      </w:r>
-    </w:p>
-    <w:p>
       <w:r>
         <w:rPr>
           <w:b/>
@@ -1815,9 +710,6 @@
       </w:r>
       <w:r>
         <w:t xml:space="preserve">  ·  Liked by creator</w:t>
-      </w:r>
-      <w:r>
-        <w:t xml:space="preserve">  ·  1 odgovora</w:t>
       </w:r>
       <w:r>
         <w:t xml:space="preserve">  ·  2026-09-22 17:51</w:t>
@@ -1833,20 +725,6 @@
       </w:r>
     </w:p>
     <w:p>
-      <w:pPr>
-        <w:ind w:left="567"/>
-      </w:pPr>
-      <w:r>
-        <w:rPr>
-          <w:i/>
-        </w:rPr>
-        <w:t xml:space="preserve">↳ 2❤  Vukašin (@vukasin.vvl): </w:t>
-      </w:r>
-      <w:r>
-        <w:t>🤔</w:t>
-      </w:r>
-    </w:p>
-    <w:p>
       <w:r>
         <w:rPr>
           <w:b/>
@@ -1941,9 +819,6 @@
         <w:t xml:space="preserve">  ·  Liked by creator</w:t>
       </w:r>
       <w:r>
-        <w:t xml:space="preserve">  ·  1 odgovora</w:t>
-      </w:r>
-      <w:r>
         <w:t xml:space="preserve">  ·  2026-09-22 17:38</w:t>
       </w:r>
     </w:p>
@@ -1957,20 +832,6 @@
       </w:r>
     </w:p>
     <w:p>
-      <w:pPr>
-        <w:ind w:left="567"/>
-      </w:pPr>
-      <w:r>
-        <w:rPr>
-          <w:i/>
-        </w:rPr>
-        <w:t xml:space="preserve">↳ 1❤  Vukašin (@vukasin.vvl): </w:t>
-      </w:r>
-      <w:r>
-        <w:t>🤔</w:t>
-      </w:r>
-    </w:p>
-    <w:p>
       <w:r>
         <w:rPr>
           <w:b/>
@@ -2039,9 +900,6 @@
         <w:t xml:space="preserve">  ·  Liked by creator</w:t>
       </w:r>
       <w:r>
-        <w:t xml:space="preserve">  ·  1 odgovora</w:t>
-      </w:r>
-      <w:r>
         <w:t xml:space="preserve">  ·  2026-09-23 06:13</w:t>
       </w:r>
     </w:p>
@@ -2055,20 +913,6 @@
       </w:r>
     </w:p>
     <w:p>
-      <w:pPr>
-        <w:ind w:left="567"/>
-      </w:pPr>
-      <w:r>
-        <w:rPr>
-          <w:i/>
-        </w:rPr>
-        <w:t xml:space="preserve">↳ 0❤  Vukašin (@vukasin.vvl): </w:t>
-      </w:r>
-      <w:r>
-        <w:t>🤔</w:t>
-      </w:r>
-    </w:p>
-    <w:p>
       <w:r>
         <w:rPr>
           <w:b/>
@@ -2111,9 +955,6 @@
         <w:t xml:space="preserve">  ·  Liked by creator</w:t>
       </w:r>
       <w:r>
-        <w:t xml:space="preserve">  ·  1 odgovora</w:t>
-      </w:r>
-      <w:r>
         <w:t xml:space="preserve">  ·  2026-09-22 18:09</w:t>
       </w:r>
     </w:p>
@@ -2127,20 +968,6 @@
       </w:r>
     </w:p>
     <w:p>
-      <w:pPr>
-        <w:ind w:left="567"/>
-      </w:pPr>
-      <w:r>
-        <w:rPr>
-          <w:i/>
-        </w:rPr>
-        <w:t xml:space="preserve">↳ 2❤  Vukašin (@vukasin.vvl): </w:t>
-      </w:r>
-      <w:r>
-        <w:t>😭</w:t>
-      </w:r>
-    </w:p>
-    <w:p>
       <w:r>
         <w:rPr>
           <w:b/>
@@ -2152,9 +979,6 @@
           <w:b/>
         </w:rPr>
         <w:t>🦕 (@unastojanovic3)</w:t>
-      </w:r>
-      <w:r>
-        <w:t xml:space="preserve">  ·  3 odgovora</w:t>
       </w:r>
       <w:r>
         <w:t xml:space="preserve">  ·  2026-09-22 19:51</w:t>
@@ -2170,48 +994,6 @@
       </w:r>
     </w:p>
     <w:p>
-      <w:pPr>
-        <w:ind w:left="567"/>
-      </w:pPr>
-      <w:r>
-        <w:rPr>
-          <w:i/>
-        </w:rPr>
-        <w:t xml:space="preserve">↳ 1❤  💸 (@iskrastokic): </w:t>
-      </w:r>
-      <w:r>
-        <w:t>opaaa</w:t>
-      </w:r>
-    </w:p>
-    <w:p>
-      <w:pPr>
-        <w:ind w:left="567"/>
-      </w:pPr>
-      <w:r>
-        <w:rPr>
-          <w:i/>
-        </w:rPr>
-        <w:t xml:space="preserve">↳ 1❤  🦕 (@unastojanovic3): </w:t>
-      </w:r>
-      <w:r>
-        <w:t>zanima me</w:t>
-      </w:r>
-    </w:p>
-    <w:p>
-      <w:pPr>
-        <w:ind w:left="567"/>
-      </w:pPr>
-      <w:r>
-        <w:rPr>
-          <w:i/>
-        </w:rPr>
-        <w:t xml:space="preserve">↳ 0❤  💸 (@iskrastokic): </w:t>
-      </w:r>
-      <w:r>
-        <w:t>brao</w:t>
-      </w:r>
-    </w:p>
-    <w:p>
       <w:r>
         <w:rPr>
           <w:b/>
@@ -2280,9 +1062,6 @@
         <w:t xml:space="preserve">  ·  Liked by creator</w:t>
       </w:r>
       <w:r>
-        <w:t xml:space="preserve">  ·  1 odgovora</w:t>
-      </w:r>
-      <w:r>
         <w:t xml:space="preserve">  ·  2026-09-22 17:50</w:t>
       </w:r>
     </w:p>
@@ -2296,20 +1075,6 @@
       </w:r>
     </w:p>
     <w:p>
-      <w:pPr>
-        <w:ind w:left="567"/>
-      </w:pPr>
-      <w:r>
-        <w:rPr>
-          <w:i/>
-        </w:rPr>
-        <w:t xml:space="preserve">↳ 1❤  Vukašin (@vukasin.vvl): </w:t>
-      </w:r>
-      <w:r>
-        <w:t>🤔</w:t>
-      </w:r>
-    </w:p>
-    <w:p>
       <w:r>
         <w:rPr>
           <w:b/>
@@ -2324,9 +1089,6 @@
       </w:r>
       <w:r>
         <w:t xml:space="preserve">  ·  Liked by creator</w:t>
-      </w:r>
-      <w:r>
-        <w:t xml:space="preserve">  ·  1 odgovora</w:t>
       </w:r>
       <w:r>
         <w:t xml:space="preserve">  ·  2026-09-22 17:52</w:t>
@@ -2342,20 +1104,6 @@
       </w:r>
     </w:p>
     <w:p>
-      <w:pPr>
-        <w:ind w:left="567"/>
-      </w:pPr>
-      <w:r>
-        <w:rPr>
-          <w:i/>
-        </w:rPr>
-        <w:t xml:space="preserve">↳ 1❤  Vukašin (@vukasin.vvl): </w:t>
-      </w:r>
-      <w:r>
-        <w:t>🤔</w:t>
-      </w:r>
-    </w:p>
-    <w:p>
       <w:r>
         <w:rPr>
           <w:b/>
@@ -2450,9 +1198,6 @@
         <w:t xml:space="preserve">  ·  Liked by creator</w:t>
       </w:r>
       <w:r>
-        <w:t xml:space="preserve">  ·  1 odgovora</w:t>
-      </w:r>
-      <w:r>
         <w:t xml:space="preserve">  ·  2026-09-22 17:41</w:t>
       </w:r>
     </w:p>
@@ -2466,20 +1211,6 @@
       </w:r>
     </w:p>
     <w:p>
-      <w:pPr>
-        <w:ind w:left="567"/>
-      </w:pPr>
-      <w:r>
-        <w:rPr>
-          <w:i/>
-        </w:rPr>
-        <w:t xml:space="preserve">↳ 0❤  Vukašin (@vukasin.vvl): </w:t>
-      </w:r>
-      <w:r>
-        <w:t>🤔</w:t>
-      </w:r>
-    </w:p>
-    <w:p>
       <w:r>
         <w:rPr>
           <w:b/>
@@ -2494,9 +1225,6 @@
       </w:r>
       <w:r>
         <w:t xml:space="preserve">  ·  Liked by creator</w:t>
-      </w:r>
-      <w:r>
-        <w:t xml:space="preserve">  ·  1 odgovora</w:t>
       </w:r>
       <w:r>
         <w:t xml:space="preserve">  ·  2026-09-22 17:52</w:t>
@@ -2512,20 +1240,6 @@
       </w:r>
     </w:p>
     <w:p>
-      <w:pPr>
-        <w:ind w:left="567"/>
-      </w:pPr>
-      <w:r>
-        <w:rPr>
-          <w:i/>
-        </w:rPr>
-        <w:t xml:space="preserve">↳ 0❤  Vukašin (@vukasin.vvl): </w:t>
-      </w:r>
-      <w:r>
-        <w:t>🤔</w:t>
-      </w:r>
-    </w:p>
-    <w:p>
       <w:r>
         <w:rPr>
           <w:b/>
@@ -2565,9 +1279,6 @@
         <w:t>ɐɾuᴉɯ🍫 (@silkyangelmess)</w:t>
       </w:r>
       <w:r>
-        <w:t xml:space="preserve">  ·  1 odgovora</w:t>
-      </w:r>
-      <w:r>
         <w:t xml:space="preserve">  ·  2026-09-22 19:12</w:t>
       </w:r>
     </w:p>
@@ -2581,20 +1292,6 @@
       </w:r>
     </w:p>
     <w:p>
-      <w:pPr>
-        <w:ind w:left="567"/>
-      </w:pPr>
-      <w:r>
-        <w:rPr>
-          <w:i/>
-        </w:rPr>
-        <w:t xml:space="preserve">↳ 3❤  𝒂𝒅𝒓𝒊𝒋𝒂𝒏𝒂𝒂🪽 (@zivanovich01): </w:t>
-      </w:r>
-      <w:r>
-        <w:t>APSOLUTNO TREBAS NAM</w:t>
-      </w:r>
-    </w:p>
-    <w:p>
       <w:r>
         <w:rPr>
           <w:b/>
@@ -2606,9 +1303,6 @@
           <w:b/>
         </w:rPr>
         <w:t>𝓝𝓪𝓽𝓪𝓵𝓲𝓳𝓪 (@natalija3171)</w:t>
-      </w:r>
-      <w:r>
-        <w:t xml:space="preserve">  ·  2 odgovora</w:t>
       </w:r>
       <w:r>
         <w:t xml:space="preserve">  ·  2026-09-22 17:37</w:t>
@@ -2624,34 +1318,6 @@
       </w:r>
     </w:p>
     <w:p>
-      <w:pPr>
-        <w:ind w:left="567"/>
-      </w:pPr>
-      <w:r>
-        <w:rPr>
-          <w:i/>
-        </w:rPr>
-        <w:t xml:space="preserve">↳ 0❤  🖤 (@cabric_lana): </w:t>
-      </w:r>
-      <w:r>
-        <w:t>Izvini?</w:t>
-      </w:r>
-    </w:p>
-    <w:p>
-      <w:pPr>
-        <w:ind w:left="567"/>
-      </w:pPr>
-      <w:r>
-        <w:rPr>
-          <w:i/>
-        </w:rPr>
-        <w:t xml:space="preserve">↳ 0❤  𝓝𝓪𝓽𝓪𝓵𝓲𝓳𝓪 (@natalija3171): </w:t>
-      </w:r>
-      <w:r>
-        <w:t>sta?</w:t>
-      </w:r>
-    </w:p>
-    <w:p>
       <w:r>
         <w:rPr>
           <w:b/>
@@ -2663,9 +1329,6 @@
           <w:b/>
         </w:rPr>
         <w:t>Tijana Devic (@tijana6290)</w:t>
-      </w:r>
-      <w:r>
-        <w:t xml:space="preserve">  ·  1 odgovora</w:t>
       </w:r>
       <w:r>
         <w:t xml:space="preserve">  ·  2026-09-22 17:56</w:t>
@@ -2681,20 +1344,6 @@
       </w:r>
     </w:p>
     <w:p>
-      <w:pPr>
-        <w:ind w:left="567"/>
-      </w:pPr>
-      <w:r>
-        <w:rPr>
-          <w:i/>
-        </w:rPr>
-        <w:t xml:space="preserve">↳ 1❤  lana (@savicl6): </w:t>
-      </w:r>
-      <w:r>
-        <w:t>tijana</w:t>
-      </w:r>
-    </w:p>
-    <w:p>
       <w:r>
         <w:rPr>
           <w:b/>
@@ -2706,9 +1355,6 @@
           <w:b/>
         </w:rPr>
         <w:t>H🪽 (@zotovicc)</w:t>
-      </w:r>
-      <w:r>
-        <w:t xml:space="preserve">  ·  1 odgovora</w:t>
       </w:r>
       <w:r>
         <w:t xml:space="preserve">  ·  2026-09-22 18:12</w:t>
@@ -2737,9 +1383,6 @@
         <w:t>андријана (@ancciii15)</w:t>
       </w:r>
       <w:r>
-        <w:t xml:space="preserve">  ·  1 odgovora</w:t>
-      </w:r>
-      <w:r>
         <w:t xml:space="preserve">  ·  2026-09-22 18:17</w:t>
       </w:r>
     </w:p>
@@ -2753,20 +1396,6 @@
       </w:r>
     </w:p>
     <w:p>
-      <w:pPr>
-        <w:ind w:left="567"/>
-      </w:pPr>
-      <w:r>
-        <w:rPr>
-          <w:i/>
-        </w:rPr>
-        <w:t xml:space="preserve">↳ 0❤  𝓝𝓜 (@n.milovanoviccc): </w:t>
-      </w:r>
-      <w:r>
-        <w:t>Fr</w:t>
-      </w:r>
-    </w:p>
-    <w:p>
       <w:r>
         <w:rPr>
           <w:b/>
@@ -2858,9 +1487,6 @@
         <w:t>𝓢𝓪𝓻𝓲 (@vvujicics)</w:t>
       </w:r>
       <w:r>
-        <w:t xml:space="preserve">  ·  2 odgovora</w:t>
-      </w:r>
-      <w:r>
         <w:t xml:space="preserve">  ·  2026-09-22 20:56</w:t>
       </w:r>
     </w:p>
@@ -2874,34 +1500,6 @@
       </w:r>
     </w:p>
     <w:p>
-      <w:pPr>
-        <w:ind w:left="567"/>
-      </w:pPr>
-      <w:r>
-        <w:rPr>
-          <w:i/>
-        </w:rPr>
-        <w:t xml:space="preserve">↳ 1❤  nnemanjaa07 (@nnemanjaa07): </w:t>
-      </w:r>
-      <w:r>
-        <w:t>Cj</w:t>
-      </w:r>
-    </w:p>
-    <w:p>
-      <w:pPr>
-        <w:ind w:left="567"/>
-      </w:pPr>
-      <w:r>
-        <w:rPr>
-          <w:i/>
-        </w:rPr>
-        <w:t xml:space="preserve">↳ 0❤  𝓢𝓪𝓻𝓲 (@vvujicics): </w:t>
-      </w:r>
-      <w:r>
-        <w:t>😜</w:t>
-      </w:r>
-    </w:p>
-    <w:p>
       <w:r>
         <w:rPr>
           <w:b/>
@@ -2941,9 +1539,6 @@
         <w:t>Neda🎀 (@nedaradosavljevic)</w:t>
       </w:r>
       <w:r>
-        <w:t xml:space="preserve">  ·  1 odgovora</w:t>
-      </w:r>
-      <w:r>
         <w:t xml:space="preserve">  ·  2026-09-23 11:39</w:t>
       </w:r>
     </w:p>
@@ -2957,20 +1552,6 @@
       </w:r>
     </w:p>
     <w:p>
-      <w:pPr>
-        <w:ind w:left="567"/>
-      </w:pPr>
-      <w:r>
-        <w:rPr>
-          <w:i/>
-        </w:rPr>
-        <w:t xml:space="preserve">↳ 1❤  lanaa🤍 (@llannaaluki): </w:t>
-      </w:r>
-      <w:r>
-        <w:t>Nedoo</w:t>
-      </w:r>
-    </w:p>
-    <w:p>
       <w:r>
         <w:rPr>
           <w:b/>
@@ -3146,9 +1727,6 @@
         <w:t xml:space="preserve">  ·  Liked by creator</w:t>
       </w:r>
       <w:r>
-        <w:t xml:space="preserve">  ·  1 odgovora</w:t>
-      </w:r>
-      <w:r>
         <w:t xml:space="preserve">  ·  2026-09-22 18:40</w:t>
       </w:r>
     </w:p>
@@ -3162,20 +1740,6 @@
       </w:r>
     </w:p>
     <w:p>
-      <w:pPr>
-        <w:ind w:left="567"/>
-      </w:pPr>
-      <w:r>
-        <w:rPr>
-          <w:i/>
-        </w:rPr>
-        <w:t xml:space="preserve">↳ 3❤  Vukašin (@vukasin.vvl): </w:t>
-      </w:r>
-      <w:r>
-        <w:t>🤔</w:t>
-      </w:r>
-    </w:p>
-    <w:p>
       <w:r>
         <w:rPr>
           <w:b/>
@@ -3241,9 +1805,6 @@
         <w:t>Ditiriti_livesss🥱 (@dimelivess_)</w:t>
       </w:r>
       <w:r>
-        <w:t xml:space="preserve">  ·  1 odgovora</w:t>
-      </w:r>
-      <w:r>
         <w:t xml:space="preserve">  ·  2026-09-23 20:35</w:t>
       </w:r>
     </w:p>
@@ -3637,9 +2198,6 @@
         <w:t>Raona (@ranonic)</w:t>
       </w:r>
       <w:r>
-        <w:t xml:space="preserve">  ·  1 odgovora</w:t>
-      </w:r>
-      <w:r>
         <w:t xml:space="preserve">  ·  2026-09-22 17:08</w:t>
       </w:r>
     </w:p>
@@ -3653,20 +2211,6 @@
       </w:r>
     </w:p>
     <w:p>
-      <w:pPr>
-        <w:ind w:left="567"/>
-      </w:pPr>
-      <w:r>
-        <w:rPr>
-          <w:i/>
-        </w:rPr>
-        <w:t xml:space="preserve">↳ 0❤  Душан (@krgoviccc8): </w:t>
-      </w:r>
-      <w:r>
-        <w:t>Izvini raona</w:t>
-      </w:r>
-    </w:p>
-    <w:p>
       <w:r>
         <w:rPr>
           <w:b/>
@@ -3758,9 +2302,6 @@
         <w:t>chuu chuu🚂 (@faveblink)</w:t>
       </w:r>
       <w:r>
-        <w:t xml:space="preserve">  ·  1 odgovora</w:t>
-      </w:r>
-      <w:r>
         <w:t xml:space="preserve">  ·  2026-09-22 17:50</w:t>
       </w:r>
     </w:p>
@@ -3774,20 +2315,6 @@
       </w:r>
     </w:p>
     <w:p>
-      <w:pPr>
-        <w:ind w:left="567"/>
-      </w:pPr>
-      <w:r>
-        <w:rPr>
-          <w:i/>
-        </w:rPr>
-        <w:t xml:space="preserve">↳ 1❤  𝓘𝓽𝓪𝓷𝓪📸 (@prelevicc.i): </w:t>
-      </w:r>
-      <w:r>
-        <w:t>AHHAHAHAAH</w:t>
-      </w:r>
-    </w:p>
-    <w:p>
       <w:r>
         <w:rPr>
           <w:b/>
@@ -3879,9 +2406,6 @@
         <w:t>Ajla🫰🏻🪽 (@ajla8315)</w:t>
       </w:r>
       <w:r>
-        <w:t xml:space="preserve">  ·  2 odgovora</w:t>
-      </w:r>
-      <w:r>
         <w:t xml:space="preserve">  ·  2026-09-22 18:52</w:t>
       </w:r>
     </w:p>
@@ -3895,34 +2419,6 @@
       </w:r>
     </w:p>
     <w:p>
-      <w:pPr>
-        <w:ind w:left="567"/>
-      </w:pPr>
-      <w:r>
-        <w:rPr>
-          <w:i/>
-        </w:rPr>
-        <w:t xml:space="preserve">↳ 0❤  🪩𝒁𝒂𝒏𝒂🍁 (@zana29584): </w:t>
-      </w:r>
-      <w:r>
-        <w:t>DA</w:t>
-      </w:r>
-    </w:p>
-    <w:p>
-      <w:pPr>
-        <w:ind w:left="567"/>
-      </w:pPr>
-      <w:r>
-        <w:rPr>
-          <w:i/>
-        </w:rPr>
-        <w:t xml:space="preserve">↳ 0❤  Ajla🫰🏻🪽 (@ajla8315): </w:t>
-      </w:r>
-      <w:r>
-        <w:t>Luli💔</w:t>
-      </w:r>
-    </w:p>
-    <w:p>
       <w:r>
         <w:rPr>
           <w:b/>
@@ -4144,9 +2640,6 @@
         <w:t>lenka (@lenkakrejakovic)</w:t>
       </w:r>
       <w:r>
-        <w:t xml:space="preserve">  ·  1 odgovora</w:t>
-      </w:r>
-      <w:r>
         <w:t xml:space="preserve">  ·  2026-09-22 20:25</w:t>
       </w:r>
     </w:p>
@@ -4160,20 +2653,6 @@
       </w:r>
     </w:p>
     <w:p>
-      <w:pPr>
-        <w:ind w:left="567"/>
-      </w:pPr>
-      <w:r>
-        <w:rPr>
-          <w:i/>
-        </w:rPr>
-        <w:t xml:space="preserve">↳ 0❤  𝒮𝒶𝓇𝒶_ 𝓅𝓇𝒾𝓋 (@saricacarica138): </w:t>
-      </w:r>
-      <w:r>
-        <w:t>🤨</w:t>
-      </w:r>
-    </w:p>
-    <w:p>
       <w:r>
         <w:rPr>
           <w:b/>
@@ -4213,9 +2692,6 @@
         <w:t>Jovan(: slavic (@js_md_edits)</w:t>
       </w:r>
       <w:r>
-        <w:t xml:space="preserve">  ·  1 odgovora</w:t>
-      </w:r>
-      <w:r>
         <w:t xml:space="preserve">  ·  2026-09-22 20:49</w:t>
       </w:r>
     </w:p>
@@ -4229,20 +2705,6 @@
       </w:r>
     </w:p>
     <w:p>
-      <w:pPr>
-        <w:ind w:left="567"/>
-      </w:pPr>
-      <w:r>
-        <w:rPr>
-          <w:i/>
-        </w:rPr>
-        <w:t xml:space="preserve">↳ 3❤  ksenijicaa (@_ksenija_najjaca_): </w:t>
-      </w:r>
-      <w:r>
-        <w:t>Au jovane</w:t>
-      </w:r>
-    </w:p>
-    <w:p>
       <w:r>
         <w:rPr>
           <w:b/>
@@ -4334,9 +2796,6 @@
         <w:t>🩷Anđa 💞 (@anelija.tanackovi)</w:t>
       </w:r>
       <w:r>
-        <w:t xml:space="preserve">  ·  1 odgovora</w:t>
-      </w:r>
-      <w:r>
         <w:t xml:space="preserve">  ·  2026-09-23 05:54</w:t>
       </w:r>
     </w:p>
@@ -4350,20 +2809,6 @@
       </w:r>
     </w:p>
     <w:p>
-      <w:pPr>
-        <w:ind w:left="567"/>
-      </w:pPr>
-      <w:r>
-        <w:rPr>
-          <w:i/>
-        </w:rPr>
-        <w:t xml:space="preserve">↳ 0❤  𝐌𝐑𝐊𝐕𝐀ᢉ𐭩 (@mrtvica67): </w:t>
-      </w:r>
-      <w:r>
-        <w:t>to nije Lara</w:t>
-      </w:r>
-    </w:p>
-    <w:p>
       <w:r>
         <w:rPr>
           <w:b/>
@@ -4507,9 +2952,6 @@
         <w:t>isi_dora (@isidoratisma44)</w:t>
       </w:r>
       <w:r>
-        <w:t xml:space="preserve">  ·  1 odgovora</w:t>
-      </w:r>
-      <w:r>
         <w:t xml:space="preserve">  ·  2026-09-23 16:47</w:t>
       </w:r>
     </w:p>
@@ -4523,20 +2965,6 @@
       </w:r>
     </w:p>
     <w:p>
-      <w:pPr>
-        <w:ind w:left="567"/>
-      </w:pPr>
-      <w:r>
-        <w:rPr>
-          <w:i/>
-        </w:rPr>
-        <w:t xml:space="preserve">↳ 0❤  🪽🌸 (@anja130611): </w:t>
-      </w:r>
-      <w:r>
-        <w:t>Bukkkkkkk</w:t>
-      </w:r>
-    </w:p>
-    <w:p>
       <w:r>
         <w:rPr>
           <w:b/>
@@ -4548,9 +2976,6 @@
           <w:b/>
         </w:rPr>
         <w:t>standupman993 (@standupman993)</w:t>
-      </w:r>
-      <w:r>
-        <w:t xml:space="preserve">  ·  1 odgovora</w:t>
       </w:r>
       <w:r>
         <w:t xml:space="preserve">  ·  2026-09-23 21:14</w:t>
@@ -4566,20 +2991,6 @@
       </w:r>
     </w:p>
     <w:p>
-      <w:pPr>
-        <w:ind w:left="567"/>
-      </w:pPr>
-      <w:r>
-        <w:rPr>
-          <w:i/>
-        </w:rPr>
-        <w:t xml:space="preserve">↳ 0❤  . (@nesa.manjak): </w:t>
-      </w:r>
-      <w:r>
-        <w:t>isto msm ali očigledno niko vise</w:t>
-      </w:r>
-    </w:p>
-    <w:p>
       <w:r>
         <w:rPr>
           <w:b/>
@@ -4619,9 +3030,6 @@
         <w:t>N🌷 (@nevenaoparusi)</w:t>
       </w:r>
       <w:r>
-        <w:t xml:space="preserve">  ·  1 odgovora</w:t>
-      </w:r>
-      <w:r>
         <w:t xml:space="preserve">  ·  2026-09-24 12:30</w:t>
       </w:r>
     </w:p>
@@ -4635,20 +3043,6 @@
       </w:r>
     </w:p>
     <w:p>
-      <w:pPr>
-        <w:ind w:left="567"/>
-      </w:pPr>
-      <w:r>
-        <w:rPr>
-          <w:i/>
-        </w:rPr>
-        <w:t xml:space="preserve">↳ 0❤  🍁★duki~ʚ♡⃛ɞ🦌 (@dunja6700): </w:t>
-      </w:r>
-      <w:r>
-        <w:t>ovo je malo cringe</w:t>
-      </w:r>
-    </w:p>
-    <w:p>
       <w:r>
         <w:rPr>
           <w:b/>
@@ -4714,9 +3108,6 @@
         <w:t>𝓭𝓳𝓾𝓻𝓭𝓳𝓪 (@djjjjidjjjjji)</w:t>
       </w:r>
       <w:r>
-        <w:t xml:space="preserve">  ·  1 odgovora</w:t>
-      </w:r>
-      <w:r>
         <w:t xml:space="preserve">  ·  2026-09-25 08:52</w:t>
       </w:r>
     </w:p>
@@ -4730,20 +3121,6 @@
       </w:r>
     </w:p>
     <w:p>
-      <w:pPr>
-        <w:ind w:left="567"/>
-      </w:pPr>
-      <w:r>
-        <w:rPr>
-          <w:i/>
-        </w:rPr>
-        <w:t xml:space="preserve">↳ 0❤  semafor🌹 (@wseclmb): </w:t>
-      </w:r>
-      <w:r>
-        <w:t>ne da mu se</w:t>
-      </w:r>
-    </w:p>
-    <w:p>
       <w:r>
         <w:rPr>
           <w:b/>
@@ -5173,9 +3550,6 @@
         <w:t>nadja.milivojevicc (@nadja.milivojevicc)</w:t>
       </w:r>
       <w:r>
-        <w:t xml:space="preserve">  ·  1 odgovora</w:t>
-      </w:r>
-      <w:r>
         <w:t xml:space="preserve">  ·  2026-09-22 20:13</w:t>
       </w:r>
     </w:p>
@@ -5186,20 +3560,6 @@
       </w:pPr>
       <w:r>
         <w:t>NISAM NI DOSLA DO EPIZODE GDE ISPADA SADA MI JE SPOILOVANO</w:t>
-      </w:r>
-    </w:p>
-    <w:p>
-      <w:pPr>
-        <w:ind w:left="567"/>
-      </w:pPr>
-      <w:r>
-        <w:rPr>
-          <w:i/>
-        </w:rPr>
-        <w:t xml:space="preserve">↳ 2❤  ￴ ￴ ￴ ￴ (@kostadinovicandrijaa): </w:t>
-      </w:r>
-      <w:r>
-        <w:t>Ok</w:t>
       </w:r>
     </w:p>
     <w:p>
@@ -7014,9 +5374,6 @@
         <w:t>Inesss (@martinacigvan1)</w:t>
       </w:r>
       <w:r>
-        <w:t xml:space="preserve">  ·  2 odgovora</w:t>
-      </w:r>
-      <w:r>
         <w:t xml:space="preserve">  ·  2026-09-23 13:49</w:t>
       </w:r>
     </w:p>
@@ -7030,34 +5387,6 @@
       </w:r>
     </w:p>
     <w:p>
-      <w:pPr>
-        <w:ind w:left="567"/>
-      </w:pPr>
-      <w:r>
-        <w:rPr>
-          <w:i/>
-        </w:rPr>
-        <w:t xml:space="preserve">↳ 0❤  zivot (@zivot304): </w:t>
-      </w:r>
-      <w:r>
-        <w:t>Da</w:t>
-      </w:r>
-    </w:p>
-    <w:p>
-      <w:pPr>
-        <w:ind w:left="567"/>
-      </w:pPr>
-      <w:r>
-        <w:rPr>
-          <w:i/>
-        </w:rPr>
-        <w:t xml:space="preserve">↳ 0❤  Inesss (@martinacigvan1): </w:t>
-      </w:r>
-      <w:r>
-        <w:t>ok</w:t>
-      </w:r>
-    </w:p>
-    <w:p>
       <w:r>
         <w:rPr>
           <w:b/>
@@ -7747,9 +6076,6 @@
         <w:t>☆Callmemajmune☆ (@sofijazindovic3)</w:t>
       </w:r>
       <w:r>
-        <w:t xml:space="preserve">  ·  3 odgovora</w:t>
-      </w:r>
-      <w:r>
         <w:t xml:space="preserve">  ·  2026-09-23 19:09</w:t>
       </w:r>
     </w:p>
@@ -7763,48 +6089,6 @@
       </w:r>
     </w:p>
     <w:p>
-      <w:pPr>
-        <w:ind w:left="567"/>
-      </w:pPr>
-      <w:r>
-        <w:rPr>
-          <w:i/>
-        </w:rPr>
-        <w:t xml:space="preserve">↳ 0❤  Suvix (@suvix78): </w:t>
-      </w:r>
-      <w:r>
-        <w:t>odakle pa ti ovde</w:t>
-      </w:r>
-    </w:p>
-    <w:p>
-      <w:pPr>
-        <w:ind w:left="567"/>
-      </w:pPr>
-      <w:r>
-        <w:rPr>
-          <w:i/>
-        </w:rPr>
-        <w:t xml:space="preserve">↳ 0❤  ☆Callmemajmune☆ (@sofijazindovic3): </w:t>
-      </w:r>
-      <w:r>
-        <w:t>pa pratim epizode</w:t>
-      </w:r>
-    </w:p>
-    <w:p>
-      <w:pPr>
-        <w:ind w:left="567"/>
-      </w:pPr>
-      <w:r>
-        <w:rPr>
-          <w:i/>
-        </w:rPr>
-        <w:t xml:space="preserve">↳ 0❤  Suvix (@suvix78): </w:t>
-      </w:r>
-      <w:r>
-        <w:t>opaaaa</w:t>
-      </w:r>
-    </w:p>
-    <w:p>
       <w:r>
         <w:rPr>
           <w:b/>
@@ -7870,9 +6154,6 @@
         <w:t>sofijapetrovic (@sofijapetrovicp)</w:t>
       </w:r>
       <w:r>
-        <w:t xml:space="preserve">  ·  1 odgovora</w:t>
-      </w:r>
-      <w:r>
         <w:t xml:space="preserve">  ·  2026-09-23 19:59</w:t>
       </w:r>
     </w:p>
@@ -7886,20 +6167,6 @@
       </w:r>
     </w:p>
     <w:p>
-      <w:pPr>
-        <w:ind w:left="567"/>
-      </w:pPr>
-      <w:r>
-        <w:rPr>
-          <w:i/>
-        </w:rPr>
-        <w:t xml:space="preserve">↳ 0❤  semafor🌹 (@wseclmb): </w:t>
-      </w:r>
-      <w:r>
-        <w:t>da</w:t>
-      </w:r>
-    </w:p>
-    <w:p>
       <w:r>
         <w:rPr>
           <w:b/>
@@ -9211,9 +7478,6 @@
           <w:b/>
         </w:rPr>
         <w:t>GOAT🐐 (@jasna.jovanovic63)</w:t>
-      </w:r>
-      <w:r>
-        <w:t xml:space="preserve">  ·  1 odgovora</w:t>
       </w:r>
       <w:r>
         <w:t xml:space="preserve">  ·  2026-09-25 10:46</w:t>

</xml_diff>